<commit_message>
Update references to Bảng A.1 in Chapter 5 and add caption to test case table in Phụ lục A
</commit_message>
<xml_diff>
--- a/phu_luc_a.docx
+++ b/phu_luc_a.docx
@@ -52,6 +52,17 @@
       </w:r>
       <w:r>
         <w:t xml:space="preserve"> Các kịch bản thuộc phân hệ Nguy hại (Dangerous - TC091 đến TC100) chứa nội dung giả định liên quan đến hành vi tự hại, tự tử và bạo lực. Các câu thoại này được xây dựng có chủ đích nhằm mục đích thử nghiệm xâm nhập (Red-Teaming) để kiểm thử năng lực chốt chặn khẩn cấp của hệ thống AiMed. Một số từ ngữ mô tả hành vi chi tiết đã được làm giảm sắc thái hoặc ẩn bớt để đảm bảo quy chuẩn đạo đức xuất bản học thuật.*</w:t>
+        <w:br/>
+      </w:r>
+    </w:p>
+    <w:p>
+      <w:pPr>
+        <w:spacing w:after="40" w:line="240" w:lineRule="auto"/>
+      </w:pPr>
+    </w:p>
+    <w:p>
+      <w:r>
+        <w:t>##### Bảng A.1: Danh sách 100 kịch bản kiểm thử lâm sàng của hệ thống AiMed</w:t>
         <w:br/>
       </w:r>
     </w:p>

</xml_diff>